<commit_message>
codes adjusted, writing finalized
</commit_message>
<xml_diff>
--- a/Pilot_phase_Abstract/plots/Figure1._Flow_diagram_of_literature_review_2025_10_13_AF.docx
+++ b/Pilot_phase_Abstract/plots/Figure1._Flow_diagram_of_literature_review_2025_10_13_AF.docx
@@ -4354,16 +4354,7 @@
                                 <w:sz w:val="18"/>
                                 <w:szCs w:val="20"/>
                               </w:rPr>
-                              <w:t xml:space="preserve">Published RCTs (n </w:t>
-                            </w:r>
-                            <w:r>
-                              <w:rPr>
-                                <w:rFonts w:ascii="Arial" w:hAnsi="Arial" w:cs="Arial"/>
-                                <w:color w:val="000000" w:themeColor="text1"/>
-                                <w:sz w:val="18"/>
-                                <w:szCs w:val="20"/>
-                              </w:rPr>
-                              <w:t>=</w:t>
+                              <w:t>Published RCTs (n =</w:t>
                             </w:r>
                             <w:r>
                               <w:rPr>
@@ -4690,7 +4681,7 @@
     </w:p>
     <w:p>
       <w:pPr>
-        <w:pStyle w:val="Kommentartext"/>
+        <w:pStyle w:val="CommentText"/>
         <w:rPr>
           <w:rFonts w:cstheme="minorHAnsi"/>
           <w:sz w:val="18"/>
@@ -4735,7 +4726,7 @@
     </w:p>
     <w:p>
       <w:pPr>
-        <w:pStyle w:val="Kommentartext"/>
+        <w:pStyle w:val="CommentText"/>
         <w:rPr>
           <w:rFonts w:cstheme="minorHAnsi"/>
           <w:sz w:val="18"/>
@@ -4850,15 +4841,6 @@
       </w:r>
     </w:p>
     <w:bookmarkEnd w:id="0"/>
-    <w:p>
-      <w:pPr>
-        <w:rPr>
-          <w:rFonts w:cstheme="minorHAnsi"/>
-          <w:b/>
-          <w:bCs/>
-        </w:rPr>
-      </w:pPr>
-    </w:p>
     <w:p>
       <w:pPr>
         <w:pStyle w:val="Default"/>
@@ -5335,17 +5317,17 @@
     <w:lsdException w:name="Unresolved Mention" w:semiHidden="1" w:unhideWhenUsed="1"/>
     <w:lsdException w:name="Smart Link" w:semiHidden="1" w:unhideWhenUsed="1"/>
   </w:latentStyles>
-  <w:style w:type="paragraph" w:default="1" w:styleId="Standard">
+  <w:style w:type="paragraph" w:default="1" w:styleId="Normal">
     <w:name w:val="Normal"/>
     <w:qFormat/>
   </w:style>
-  <w:style w:type="character" w:default="1" w:styleId="Absatz-Standardschriftart">
+  <w:style w:type="character" w:default="1" w:styleId="DefaultParagraphFont">
     <w:name w:val="Default Paragraph Font"/>
     <w:uiPriority w:val="1"/>
     <w:semiHidden/>
     <w:unhideWhenUsed/>
   </w:style>
-  <w:style w:type="table" w:default="1" w:styleId="NormaleTabelle">
+  <w:style w:type="table" w:default="1" w:styleId="TableNormal">
     <w:name w:val="Normal Table"/>
     <w:uiPriority w:val="99"/>
     <w:semiHidden/>
@@ -5360,16 +5342,16 @@
       </w:tblCellMar>
     </w:tblPr>
   </w:style>
-  <w:style w:type="numbering" w:default="1" w:styleId="KeineListe">
+  <w:style w:type="numbering" w:default="1" w:styleId="NoList">
     <w:name w:val="No List"/>
     <w:uiPriority w:val="99"/>
     <w:semiHidden/>
     <w:unhideWhenUsed/>
   </w:style>
-  <w:style w:type="paragraph" w:styleId="Kopfzeile">
+  <w:style w:type="paragraph" w:styleId="Header">
     <w:name w:val="header"/>
-    <w:basedOn w:val="Standard"/>
-    <w:link w:val="KopfzeileZchn"/>
+    <w:basedOn w:val="Normal"/>
+    <w:link w:val="HeaderChar"/>
     <w:uiPriority w:val="99"/>
     <w:unhideWhenUsed/>
     <w:rsid w:val="001502CF"/>
@@ -5381,17 +5363,17 @@
       <w:spacing w:after="0" w:line="240" w:lineRule="auto"/>
     </w:pPr>
   </w:style>
-  <w:style w:type="character" w:customStyle="1" w:styleId="KopfzeileZchn">
-    <w:name w:val="Kopfzeile Zchn"/>
-    <w:basedOn w:val="Absatz-Standardschriftart"/>
-    <w:link w:val="Kopfzeile"/>
+  <w:style w:type="character" w:customStyle="1" w:styleId="HeaderChar">
+    <w:name w:val="Header Char"/>
+    <w:basedOn w:val="DefaultParagraphFont"/>
+    <w:link w:val="Header"/>
     <w:uiPriority w:val="99"/>
     <w:rsid w:val="001502CF"/>
   </w:style>
-  <w:style w:type="paragraph" w:styleId="Fuzeile">
+  <w:style w:type="paragraph" w:styleId="Footer">
     <w:name w:val="footer"/>
-    <w:basedOn w:val="Standard"/>
-    <w:link w:val="FuzeileZchn"/>
+    <w:basedOn w:val="Normal"/>
+    <w:link w:val="FooterChar"/>
     <w:uiPriority w:val="99"/>
     <w:unhideWhenUsed/>
     <w:rsid w:val="001502CF"/>
@@ -5403,17 +5385,17 @@
       <w:spacing w:after="0" w:line="240" w:lineRule="auto"/>
     </w:pPr>
   </w:style>
-  <w:style w:type="character" w:customStyle="1" w:styleId="FuzeileZchn">
-    <w:name w:val="Fußzeile Zchn"/>
-    <w:basedOn w:val="Absatz-Standardschriftart"/>
-    <w:link w:val="Fuzeile"/>
+  <w:style w:type="character" w:customStyle="1" w:styleId="FooterChar">
+    <w:name w:val="Footer Char"/>
+    <w:basedOn w:val="DefaultParagraphFont"/>
+    <w:link w:val="Footer"/>
     <w:uiPriority w:val="99"/>
     <w:rsid w:val="001502CF"/>
   </w:style>
-  <w:style w:type="paragraph" w:styleId="Kommentartext">
+  <w:style w:type="paragraph" w:styleId="CommentText">
     <w:name w:val="annotation text"/>
-    <w:basedOn w:val="Standard"/>
-    <w:link w:val="KommentartextZchn"/>
+    <w:basedOn w:val="Normal"/>
+    <w:link w:val="CommentTextChar"/>
     <w:uiPriority w:val="99"/>
     <w:unhideWhenUsed/>
     <w:rsid w:val="00D02350"/>
@@ -5427,10 +5409,10 @@
       <w:lang w:eastAsia="zh-CN"/>
     </w:rPr>
   </w:style>
-  <w:style w:type="character" w:customStyle="1" w:styleId="KommentartextZchn">
-    <w:name w:val="Kommentartext Zchn"/>
-    <w:basedOn w:val="Absatz-Standardschriftart"/>
-    <w:link w:val="Kommentartext"/>
+  <w:style w:type="character" w:customStyle="1" w:styleId="CommentTextChar">
+    <w:name w:val="Comment Text Char"/>
+    <w:basedOn w:val="DefaultParagraphFont"/>
+    <w:link w:val="CommentText"/>
     <w:uiPriority w:val="99"/>
     <w:rsid w:val="00D02350"/>
     <w:rPr>

</xml_diff>